<commit_message>
WIP: Eyal's ranges of 9 Oct (EC/pH/level bands) on the pool monitor hotfix
</commit_message>
<xml_diff>
--- a/nexidoc/Nexi_User_Guide_v22.20.docx
+++ b/nexidoc/Nexi_User_Guide_v22.20.docx
@@ -6243,7 +6243,7 @@
     </w:p>
     <w:p>
       <w:r>
-        <w:t>Alarms: a reading out of range opens ONE call per pool and problem, judged on the latest round. When the next reading is back in range, Nexi closes that call and its task by itself. Readings typed on two computers are combined: each value keeps its newest entry, and nothing typed is lost when the cloud download finishes.</w:t>
+        <w:t>Alarms: a CRITICAL EC or pH reading opens ONE call per pool and problem, judged on the latest round. When the next reading is no longer critical, Nexi closes that call and its task by itself. A warning only turns the box orange. Readings typed on two computers are combined: each value keeps its newest entry, and nothing typed is lost when the cloud download finishes.</w:t>
       </w:r>
     </w:p>
     <w:p>
@@ -6283,17 +6283,239 @@
         <w:pStyle w:val="Heading2"/>
       </w:pPr>
       <w:r>
+        <w:t>Ranges: green, orange, red (Eyal, 9 Oct)</w:t>
+      </w:r>
+    </w:p>
+    <w:p>
+      <w:r>
+        <w:t>Every reading box turns green (OK), orange (warning) or red and blinking (critical). The same ranges are used by the CRIT / WARN chip of each pool, the alarms and calls, 🎯 Smart Dosing and the line “Target ranges” above the table.</w:t>
+      </w:r>
+    </w:p>
+    <w:p>
+      <w:r>
+        <w:t>EC (mS/cm): OK 1.70 – 1.90 · warning 1.50 – 1.69 or 1.91 – 2.00 · critical below 1.50 or above 2.00.</w:t>
+      </w:r>
+    </w:p>
+    <w:p>
+      <w:r>
+        <w:t>pH: OK 5.80 – 6.50 · warning 5.50 – 5.79 or 6.51 – 6.80 · critical 5.49 and below or 6.81 and above.</w:t>
+      </w:r>
+    </w:p>
+    <w:p>
+      <w:r>
+        <w:t>Water level (cm, the level you measure): see the table. Each pool’s bands can be changed by an admin in ⚙️ Pool &amp; Drum Setup → 📏 Level bands; EC and pH ranges per pool are in the same card.</w:t>
+      </w:r>
+    </w:p>
+    <w:tbl>
+      <w:tblPr>
+        <w:tblStyle w:val="LightGrid-Accent1"/>
+        <w:tblW w:type="auto" w:w="0"/>
+        <w:tblLook w:firstColumn="1" w:firstRow="1" w:lastColumn="0" w:lastRow="0" w:noHBand="0" w:noVBand="1" w:val="04A0"/>
+      </w:tblPr>
+      <w:tblGrid>
+        <w:gridCol w:w="2160"/>
+        <w:gridCol w:w="2160"/>
+        <w:gridCol w:w="2160"/>
+        <w:gridCol w:w="2160"/>
+      </w:tblGrid>
+      <w:tr>
+        <w:tc>
+          <w:tcPr>
+            <w:tcW w:type="dxa" w:w="2160"/>
+          </w:tcPr>
+          <w:p>
+            <w:r>
+              <w:rPr>
+                <w:b/>
+              </w:rPr>
+              <w:t>Pools</w:t>
+            </w:r>
+          </w:p>
+        </w:tc>
+        <w:tc>
+          <w:tcPr>
+            <w:tcW w:type="dxa" w:w="2160"/>
+          </w:tcPr>
+          <w:p>
+            <w:r>
+              <w:rPr>
+                <w:b/>
+              </w:rPr>
+              <w:t>Good</w:t>
+            </w:r>
+          </w:p>
+        </w:tc>
+        <w:tc>
+          <w:tcPr>
+            <w:tcW w:type="dxa" w:w="2160"/>
+          </w:tcPr>
+          <w:p>
+            <w:r>
+              <w:rPr>
+                <w:b/>
+              </w:rPr>
+              <w:t>Warning</w:t>
+            </w:r>
+          </w:p>
+        </w:tc>
+        <w:tc>
+          <w:tcPr>
+            <w:tcW w:type="dxa" w:w="2160"/>
+          </w:tcPr>
+          <w:p>
+            <w:r>
+              <w:rPr>
+                <w:b/>
+              </w:rPr>
+              <w:t>Critical</w:t>
+            </w:r>
+          </w:p>
+        </w:tc>
+      </w:tr>
+      <w:tr>
+        <w:tc>
+          <w:tcPr>
+            <w:tcW w:type="dxa" w:w="2160"/>
+          </w:tcPr>
+          <w:p>
+            <w:r>
+              <w:t>GH1, GH2, GH3 &amp; GH4, GH5, GH6, GH10</w:t>
+            </w:r>
+          </w:p>
+        </w:tc>
+        <w:tc>
+          <w:tcPr>
+            <w:tcW w:type="dxa" w:w="2160"/>
+          </w:tcPr>
+          <w:p>
+            <w:r>
+              <w:t>30 – 60 cm</w:t>
+            </w:r>
+          </w:p>
+        </w:tc>
+        <w:tc>
+          <w:tcPr>
+            <w:tcW w:type="dxa" w:w="2160"/>
+          </w:tcPr>
+          <w:p>
+            <w:r>
+              <w:t>20 – 29 or 61 – 70 cm</w:t>
+            </w:r>
+          </w:p>
+        </w:tc>
+        <w:tc>
+          <w:tcPr>
+            <w:tcW w:type="dxa" w:w="2160"/>
+          </w:tcPr>
+          <w:p>
+            <w:r>
+              <w:t>below 20 or above 70 cm</w:t>
+            </w:r>
+          </w:p>
+        </w:tc>
+      </w:tr>
+      <w:tr>
+        <w:tc>
+          <w:tcPr>
+            <w:tcW w:type="dxa" w:w="2160"/>
+          </w:tcPr>
+          <w:p>
+            <w:r>
+              <w:t>GH7 &amp; GH8</w:t>
+            </w:r>
+          </w:p>
+        </w:tc>
+        <w:tc>
+          <w:tcPr>
+            <w:tcW w:type="dxa" w:w="2160"/>
+          </w:tcPr>
+          <w:p>
+            <w:r>
+              <w:t>40 – 100 cm</w:t>
+            </w:r>
+          </w:p>
+        </w:tc>
+        <w:tc>
+          <w:tcPr>
+            <w:tcW w:type="dxa" w:w="2160"/>
+          </w:tcPr>
+          <w:p>
+            <w:r>
+              <w:t>30 – 39 or 101 – 110 cm</w:t>
+            </w:r>
+          </w:p>
+        </w:tc>
+        <w:tc>
+          <w:tcPr>
+            <w:tcW w:type="dxa" w:w="2160"/>
+          </w:tcPr>
+          <w:p>
+            <w:r>
+              <w:t>below 30 or above 110 cm</w:t>
+            </w:r>
+          </w:p>
+        </w:tc>
+      </w:tr>
+      <w:tr>
+        <w:tc>
+          <w:tcPr>
+            <w:tcW w:type="dxa" w:w="2160"/>
+          </w:tcPr>
+          <w:p>
+            <w:r>
+              <w:t>GH9</w:t>
+            </w:r>
+          </w:p>
+        </w:tc>
+        <w:tc>
+          <w:tcPr>
+            <w:tcW w:type="dxa" w:w="2160"/>
+          </w:tcPr>
+          <w:p>
+            <w:r>
+              <w:t>30 – 50 cm</w:t>
+            </w:r>
+          </w:p>
+        </w:tc>
+        <w:tc>
+          <w:tcPr>
+            <w:tcW w:type="dxa" w:w="2160"/>
+          </w:tcPr>
+          <w:p>
+            <w:r>
+              <w:t>20 – 29 or 51 – 60 cm</w:t>
+            </w:r>
+          </w:p>
+        </w:tc>
+        <w:tc>
+          <w:tcPr>
+            <w:tcW w:type="dxa" w:w="2160"/>
+          </w:tcPr>
+          <w:p>
+            <w:r>
+              <w:t>below 20 or above 60 cm</w:t>
+            </w:r>
+          </w:p>
+        </w:tc>
+      </w:tr>
+    </w:tbl>
+    <w:p/>
+    <w:p>
+      <w:pPr>
+        <w:pStyle w:val="Heading2"/>
+      </w:pPr>
+      <w:r>
         <w:t>Daily target and cleaning target (v22.20)</w:t>
       </w:r>
     </w:p>
     <w:p>
       <w:r>
-        <w:t>Each pool has two water levels. The DAILY target is used for the 4 rounds: the colours, the alarms, the FILL hint and the dose. The CLEANING target is only for refilling the pool after cleaning (the old 130 / 120 / 100 cm values). Both are set by an admin in ⚙️ Pool &amp; Drum Setup.</w:t>
-      </w:r>
-    </w:p>
-    <w:p>
-      <w:r>
-        <w:t>Colours and alarms compare the level with the daily target: within ±10 cm OK, ±10–20 cm warning, more than ±20 cm critical.</w:t>
+        <w:t>Each pool has two water levels. The DAILY target is the level the daily fill brings the pool up to (the top of its GOOD band): the water to add and the dose are worked out from it. The CLEANING target is only for refilling the pool after cleaning (the old 130 / 120 / 100 cm values). Both are set by an admin in ⚙️ Pool &amp; Drum Setup.</w:t>
+      </w:r>
+    </w:p>
+    <w:p>
+      <w:r>
+        <w:t>Example: Pool 1 at 54 cm is GOOD (30 – 60). Nexi still tops it up to 60 cm: 6 cm = 121 L of water.</w:t>
       </w:r>
     </w:p>
     <w:tbl>
@@ -6454,7 +6676,7 @@
     </w:p>
     <w:p>
       <w:r>
-        <w:t>Example: Pool 1 at 54 cm with EC 1 is 6 cm under its daily 60 cm (OK, not critical): add 121 L pure water · A 2100 cc · B 2100 cc · C 30 cc.</w:t>
+        <w:t>Example: Pool 1 at 54 cm with EC 1 is 6 cm under its daily 60 cm (the level is GOOD; the EC 1 is critical, so the EC box is red): add 121 L pure water · A 2100 cc · B 2100 cc · C 30 cc.</w:t>
       </w:r>
     </w:p>
     <w:p>

</xml_diff>